<commit_message>
Add annual financial summary, highlighted checklist, and reply to John Hart
Expands the proforma's 3-Year Summary tab with full annual P&L detail
and a year-end balance-sheet snapshot (was just NPR/EBITDA/NI) to
support John's lender financial-spread tool - re-verified 23/23 on
qa_proforma_v3 after the row-layout shift.

Adds a debt-schedule detail section to the assumptions narrative
explaining why the Business Debt Schedule form carries a single line
and how it's retired by the SBA loan.

Adds a yellow-highlighted copy of John's own 7(a) checklist marking
every section applicable to this deal (skips land purchase/
construction, franchise, and COVID - none apply here).

Drafts the reply to John's 7/20 1:58pm email: explains why SBA funding
is already timed to the 51% ownership transfer, flags the residual
CMS-processing-timing question for his input, corrects the assumption
that Bullard is a 20%+ owner (he's at 19.5%), and walks through all 11
checklist items with current status.
</commit_message>
<xml_diff>
--- a/sba_application/13_checklist_response_2026-07-16/6 Projection Assumptions Narrative.docx
+++ b/sba_application/13_checklist_response_2026-07-16/6 Projection Assumptions Narrative.docx
@@ -144,6 +144,27 @@
           <w:sz w:val="20"/>
         </w:rPr>
         <w:t>Base case (Rev 4.10): the interim bank note ($500,000 at 6%/36-month) funds September and pays the sellers in full ($15,211/month October-December); the SBA 7(a) funds ~1/15/2027 and refinances the bank note (~$461,676 payoff), leaving a single $6,747/month payment (10.5%/10-year) from February. Owner salaries defer until break-even census ($42,500 accrued, repaid January); clinical hiring lags census one month with PRN coverage.</w:t>
+      </w:r>
+    </w:p>
+    <w:p>
+      <w:pPr>
+        <w:pStyle w:val="Heading1"/>
+        <w:keepNext/>
+      </w:pPr>
+      <w:r>
+        <w:rPr>
+          <w:color w:val="1F3B2D"/>
+        </w:rPr>
+        <w:t>Business Debt Schedule - detail</w:t>
+      </w:r>
+    </w:p>
+    <w:p>
+      <w:r>
+        <w:rPr>
+          <w:b w:val="0"/>
+          <w:sz w:val="20"/>
+        </w:rPr>
+        <w:t>The Business Debt Schedule form carries a single line because there is only one piece of existing/interim debt in the structure: the interim bank note, a $500,000 acquisition note funded in September 2026 by a bank relationship Jim Bullard holds in Texas, at 6.00% with a 36-month amortization and a $15,211 monthly payment. It funds the seller payoff in full - this is what the model calls the 'seller refi.' The balance shown on the form (~$461,676) is the note's projected balance as of 1/15/2027, the date the SBA 7(a) is scheduled to fund and refinance it. Collateral is the business assets, and the note is expressly structured to be repaid by the SBA loan - it is not intended to remain outstanding alongside the SBA debt. The SBA loan itself does not appear as a line on this form because it is the loan being applied for, not existing debt; once it funds and retires the bank note, the business carries a single $6,747/month SBA payment going forward with no other debt.</w:t>
       </w:r>
     </w:p>
     <w:p>

</xml_diff>